<commit_message>
added updated media release file
</commit_message>
<xml_diff>
--- a/Documentation/Implementing_Tests_for_LLM_Prompts_with_Semantic_Assertions _Team_LLM_QA_Lab_Paper.docx
+++ b/Documentation/Implementing_Tests_for_LLM_Prompts_with_Semantic_Assertions _Team_LLM_QA_Lab_Paper.docx
@@ -197,7 +197,7 @@
         <w:t>Md Abdulla AL Mahamud Rosi</w:t>
       </w:r>
     </w:p>
-    <w:p xmlns:wp14="http://schemas.microsoft.com/office/word/2010/wordml" wp14:textId="1CA72548">
+    <w:p xmlns:wp14="http://schemas.microsoft.com/office/word/2010/wordml" wp14:textId="1B7804E7">
       <w:pPr>
         <w:spacing w:before="0" w:after="60" w:line="264" w:lineRule="auto"/>
         <w:jc w:val="center"/>
@@ -212,6 +212,7 @@
           <w:color w:val="000000"/>
           <w:sz w:val="19"/>
           <w:szCs w:val="19"/>
+          <w:lang w:val="en-US"/>
         </w:rPr>
       </w:pPr>
       <w:r>
@@ -226,22 +227,9 @@
           <w:color w:val="000000"/>
           <w:sz w:val="19"/>
           <w:szCs w:val="19"/>
+          <w:lang w:val="en-US"/>
         </w:rPr>
         <w:t>[</w:t>
-      </w:r>
-      <w:r>
-        <w:rPr>
-          <w:rFonts w:ascii="Times New Roman" w:hAnsi="Times New Roman" w:eastAsia="Times New Roman" w:cs="Times New Roman"/>
-          <w:b w:val="0"/>
-          <w:bCs w:val="0"/>
-          <w:i w:val="0"/>
-          <w:iCs w:val="0"/>
-          <w:caps w:val="0"/>
-          <w:smallCaps w:val="0"/>
-          <w:sz w:val="19"/>
-          <w:szCs w:val="19"/>
-        </w:rPr>
-        <w:t>student.email@stud.fra-uas.de</w:t>
       </w:r>
       <w:r>
         <w:rPr>
@@ -255,6 +243,38 @@
           <w:color w:val="000000"/>
           <w:sz w:val="19"/>
           <w:szCs w:val="19"/>
+          <w:lang w:val="en-US"/>
+        </w:rPr>
+        <w:t>abdulla.rosi</w:t>
+      </w:r>
+      <w:r>
+        <w:rPr>
+          <w:rFonts w:ascii="Times New Roman" w:hAnsi="Times New Roman" w:eastAsia="Times New Roman" w:cs="Times New Roman"/>
+          <w:b w:val="0"/>
+          <w:bCs w:val="0"/>
+          <w:i w:val="0"/>
+          <w:iCs w:val="0"/>
+          <w:caps w:val="0"/>
+          <w:smallCaps w:val="0"/>
+          <w:sz w:val="19"/>
+          <w:szCs w:val="19"/>
+          <w:lang w:val="en-US"/>
+        </w:rPr>
+        <w:t>@stud.fra-uas.de</w:t>
+      </w:r>
+      <w:r>
+        <w:rPr>
+          <w:rFonts w:ascii="Times New Roman" w:hAnsi="Times New Roman" w:eastAsia="Times New Roman" w:cs="Times New Roman"/>
+          <w:b w:val="0"/>
+          <w:bCs w:val="0"/>
+          <w:i w:val="0"/>
+          <w:iCs w:val="0"/>
+          <w:caps w:val="0"/>
+          <w:smallCaps w:val="0"/>
+          <w:color w:val="000000"/>
+          <w:sz w:val="19"/>
+          <w:szCs w:val="19"/>
+          <w:lang w:val="en-US"/>
         </w:rPr>
         <w:t>]</w:t>
       </w:r>
@@ -1285,7 +1305,7 @@
       </w:pPr>
       <w:r>
         <w:drawing>
-          <wp:inline xmlns:wp14="http://schemas.microsoft.com/office/word/2010/wordprocessingDrawing" wp14:editId="2CCFED8F" wp14:anchorId="55B1DE84">
+          <wp:inline xmlns:wp14="http://schemas.microsoft.com/office/word/2010/wordprocessingDrawing" wp14:editId="54C6CA16" wp14:anchorId="55B1DE84">
             <wp:extent cx="2886887" cy="2324100"/>
             <wp:effectExtent l="0" t="0" r="0" b="0"/>
             <wp:docPr id="1528366591" name="drawing"/>
@@ -1377,16 +1397,43 @@
           <w:szCs w:val="19"/>
           <w:lang w:val="en-US"/>
         </w:rPr>
-        <w:t>Test cases are stored in data/</w:t>
-      </w:r>
-      <w:r>
-        <w:rPr>
-          <w:rFonts w:ascii="Times New Roman" w:hAnsi="Times New Roman" w:eastAsia="Times New Roman" w:cs="Times New Roman"/>
-          <w:sz w:val="19"/>
-          <w:szCs w:val="19"/>
-          <w:lang w:val="en-US"/>
-        </w:rPr>
-        <w:t>sample_test_cases.json</w:t>
+        <w:t>Test cases are sto</w:t>
+      </w:r>
+      <w:r>
+        <w:rPr>
+          <w:rFonts w:ascii="Times New Roman" w:hAnsi="Times New Roman" w:eastAsia="Times New Roman" w:cs="Times New Roman"/>
+          <w:sz w:val="19"/>
+          <w:szCs w:val="19"/>
+          <w:lang w:val="en-US"/>
+        </w:rPr>
+        <w:t>red in data</w:t>
+      </w:r>
+      <w:r>
+        <w:rPr>
+          <w:rFonts w:ascii="Times New Roman" w:hAnsi="Times New Roman" w:eastAsia="Times New Roman" w:cs="Times New Roman"/>
+          <w:sz w:val="19"/>
+          <w:szCs w:val="19"/>
+          <w:lang w:val="en-US"/>
+        </w:rPr>
+        <w:t>/</w:t>
+      </w:r>
+      <w:r>
+        <w:rPr>
+          <w:rFonts w:ascii="Times New Roman" w:hAnsi="Times New Roman" w:eastAsia="Times New Roman" w:cs="Times New Roman"/>
+          <w:sz w:val="19"/>
+          <w:szCs w:val="19"/>
+          <w:lang w:val="en-US"/>
+        </w:rPr>
+        <w:t>sample_test_cases.jso</w:t>
+      </w:r>
+      <w:r>
+        <w:rPr>
+          <w:rFonts w:ascii="Times New Roman" w:hAnsi="Times New Roman" w:eastAsia="Times New Roman" w:cs="Times New Roman"/>
+          <w:sz w:val="19"/>
+          <w:szCs w:val="19"/>
+          <w:lang w:val="en-US"/>
+        </w:rPr>
+        <w:t>n</w:t>
       </w:r>
       <w:r>
         <w:rPr>
@@ -1440,7 +1487,16 @@
           <w:szCs w:val="19"/>
           <w:lang w:val="en-US"/>
         </w:rPr>
-        <w:t>_c</w:t>
+        <w:t>_</w:t>
+      </w:r>
+      <w:r>
+        <w:rPr>
+          <w:rFonts w:ascii="Times New Roman" w:hAnsi="Times New Roman" w:eastAsia="Times New Roman" w:cs="Times New Roman"/>
+          <w:sz w:val="19"/>
+          <w:szCs w:val="19"/>
+          <w:lang w:val="en-US"/>
+        </w:rPr>
+        <w:t>c</w:t>
       </w:r>
       <w:r>
         <w:rPr>
@@ -2334,7 +2390,7 @@
       </w:pPr>
       <w:r>
         <w:drawing>
-          <wp:inline wp14:editId="63C17C5A" wp14:anchorId="35F80182">
+          <wp:inline wp14:editId="5D4284DA" wp14:anchorId="35F80182">
             <wp:extent cx="2857334" cy="2362200"/>
             <wp:effectExtent l="0" t="0" r="0" b="0"/>
             <wp:docPr id="1382536969" name="drawing"/>
@@ -8008,7 +8064,7 @@
       </w:pPr>
       <w:r>
         <w:drawing>
-          <wp:inline xmlns:wp14="http://schemas.microsoft.com/office/word/2010/wordprocessingDrawing" wp14:editId="64A2CFF9" wp14:anchorId="7BFC693E">
+          <wp:inline xmlns:wp14="http://schemas.microsoft.com/office/word/2010/wordprocessingDrawing" wp14:editId="055C9453" wp14:anchorId="7BFC693E">
             <wp:extent cx="2828925" cy="971550"/>
             <wp:effectExtent l="0" t="0" r="0" b="0"/>
             <wp:docPr id="175347953" name="drawing"/>
@@ -8133,7 +8189,7 @@
       </w:pPr>
       <w:r>
         <w:drawing>
-          <wp:inline wp14:editId="7EDF3611" wp14:anchorId="475961DE">
+          <wp:inline wp14:editId="39E0C871" wp14:anchorId="475961DE">
             <wp:extent cx="2897094" cy="1066800"/>
             <wp:effectExtent l="0" t="0" r="0" b="0"/>
             <wp:docPr id="94675093" name="drawing"/>
@@ -8992,7 +9048,7 @@
       </w:pPr>
       <w:r>
         <w:drawing>
-          <wp:inline wp14:editId="7605CAAF" wp14:anchorId="1F98DE2B">
+          <wp:inline wp14:editId="72EAD754" wp14:anchorId="1F98DE2B">
             <wp:extent cx="2776683" cy="2295525"/>
             <wp:effectExtent l="0" t="0" r="0" b="0"/>
             <wp:docPr id="1607423297" name="drawing"/>
@@ -9099,7 +9155,7 @@
       </w:pPr>
       <w:r>
         <w:drawing>
-          <wp:inline wp14:editId="010372AB" wp14:anchorId="2170D9A4">
+          <wp:inline wp14:editId="2965ABC1" wp14:anchorId="2170D9A4">
             <wp:extent cx="2741221" cy="2286000"/>
             <wp:effectExtent l="0" t="0" r="0" b="0"/>
             <wp:docPr id="1804541684" name="drawing"/>
@@ -10643,7 +10699,7 @@
       </w:pPr>
       <w:r>
         <w:drawing>
-          <wp:inline xmlns:wp14="http://schemas.microsoft.com/office/word/2010/wordprocessingDrawing" wp14:editId="7F4370F3" wp14:anchorId="1855F437">
+          <wp:inline xmlns:wp14="http://schemas.microsoft.com/office/word/2010/wordprocessingDrawing" wp14:editId="5F886124" wp14:anchorId="1855F437">
             <wp:extent cx="2838188" cy="1390650"/>
             <wp:effectExtent l="0" t="0" r="0" b="0"/>
             <wp:docPr id="1807771268" name="drawing"/>
@@ -10686,7 +10742,7 @@
       </w:r>
       <w:r>
         <w:drawing>
-          <wp:inline xmlns:wp14="http://schemas.microsoft.com/office/word/2010/wordprocessingDrawing" wp14:editId="1E23B935" wp14:anchorId="260CC715">
+          <wp:inline xmlns:wp14="http://schemas.microsoft.com/office/word/2010/wordprocessingDrawing" wp14:editId="573C8B7A" wp14:anchorId="260CC715">
             <wp:extent cx="2852576" cy="1343025"/>
             <wp:effectExtent l="0" t="0" r="0" b="0"/>
             <wp:docPr id="1307619941" name="drawing"/>
@@ -10840,7 +10896,7 @@
       </w:pPr>
       <w:r>
         <w:drawing>
-          <wp:inline xmlns:wp14="http://schemas.microsoft.com/office/word/2010/wordprocessingDrawing" wp14:editId="732CC566" wp14:anchorId="2850EBAE">
+          <wp:inline xmlns:wp14="http://schemas.microsoft.com/office/word/2010/wordprocessingDrawing" wp14:editId="56A246D2" wp14:anchorId="2850EBAE">
             <wp:extent cx="2876550" cy="514350"/>
             <wp:effectExtent l="0" t="0" r="0" b="0"/>
             <wp:docPr id="155673765" name="drawing"/>
@@ -10883,7 +10939,7 @@
       </w:r>
       <w:r>
         <w:drawing>
-          <wp:inline xmlns:wp14="http://schemas.microsoft.com/office/word/2010/wordprocessingDrawing" wp14:editId="7F050B34" wp14:anchorId="7257B7CE">
+          <wp:inline xmlns:wp14="http://schemas.microsoft.com/office/word/2010/wordprocessingDrawing" wp14:editId="7CB23219" wp14:anchorId="7257B7CE">
             <wp:extent cx="2857500" cy="1176011"/>
             <wp:effectExtent l="0" t="0" r="0" b="0"/>
             <wp:docPr id="596946894" name="drawing"/>
@@ -11058,7 +11114,7 @@
       </w:pPr>
       <w:r>
         <w:drawing>
-          <wp:inline xmlns:wp14="http://schemas.microsoft.com/office/word/2010/wordprocessingDrawing" wp14:editId="1333922B" wp14:anchorId="757B6673">
+          <wp:inline xmlns:wp14="http://schemas.microsoft.com/office/word/2010/wordprocessingDrawing" wp14:editId="701AC780" wp14:anchorId="757B6673">
             <wp:extent cx="2847975" cy="476250"/>
             <wp:effectExtent l="0" t="0" r="0" b="0"/>
             <wp:docPr id="634495637" name="drawing"/>
@@ -11101,7 +11157,7 @@
       </w:r>
       <w:r>
         <w:drawing>
-          <wp:inline xmlns:wp14="http://schemas.microsoft.com/office/word/2010/wordprocessingDrawing" wp14:editId="203E4B3B" wp14:anchorId="14675577">
+          <wp:inline xmlns:wp14="http://schemas.microsoft.com/office/word/2010/wordprocessingDrawing" wp14:editId="3B5A46A4" wp14:anchorId="14675577">
             <wp:extent cx="2832427" cy="1390650"/>
             <wp:effectExtent l="0" t="0" r="0" b="0"/>
             <wp:docPr id="891788248" name="drawing"/>
@@ -11293,7 +11349,7 @@
       </w:pPr>
       <w:r>
         <w:drawing>
-          <wp:inline xmlns:wp14="http://schemas.microsoft.com/office/word/2010/wordprocessingDrawing" wp14:editId="4359271A" wp14:anchorId="4498F20E">
+          <wp:inline xmlns:wp14="http://schemas.microsoft.com/office/word/2010/wordprocessingDrawing" wp14:editId="5D9BAFA7" wp14:anchorId="4498F20E">
             <wp:extent cx="2867853" cy="1428750"/>
             <wp:effectExtent l="0" t="0" r="0" b="0"/>
             <wp:docPr id="1740862073" name="drawing"/>
@@ -11441,7 +11497,7 @@
       </w:pPr>
       <w:r>
         <w:drawing>
-          <wp:inline xmlns:wp14="http://schemas.microsoft.com/office/word/2010/wordprocessingDrawing" wp14:editId="436DF80D" wp14:anchorId="4B367042">
+          <wp:inline xmlns:wp14="http://schemas.microsoft.com/office/word/2010/wordprocessingDrawing" wp14:editId="3438535B" wp14:anchorId="4B367042">
             <wp:extent cx="2878282" cy="1485900"/>
             <wp:effectExtent l="0" t="0" r="0" b="0"/>
             <wp:docPr id="371776877" name="drawing"/>
@@ -11649,7 +11705,7 @@
       </w:pPr>
       <w:r>
         <w:drawing>
-          <wp:inline wp14:editId="7909A756" wp14:anchorId="5D14EDCD">
+          <wp:inline wp14:editId="4D0E763B" wp14:anchorId="5D14EDCD">
             <wp:extent cx="2886075" cy="552450"/>
             <wp:effectExtent l="0" t="0" r="0" b="0"/>
             <wp:docPr id="1128122728" name="drawing"/>
@@ -11692,7 +11748,7 @@
       </w:r>
       <w:r>
         <w:drawing>
-          <wp:inline wp14:editId="64103DD2" wp14:anchorId="1E3856F5">
+          <wp:inline wp14:editId="1A878A91" wp14:anchorId="1E3856F5">
             <wp:extent cx="2878282" cy="1371600"/>
             <wp:effectExtent l="0" t="0" r="0" b="0"/>
             <wp:docPr id="1424259916" name="drawing"/>
@@ -12149,7 +12205,7 @@
       </w:pPr>
       <w:r>
         <w:drawing>
-          <wp:inline xmlns:wp14="http://schemas.microsoft.com/office/word/2010/wordprocessingDrawing" wp14:editId="0A034E69" wp14:anchorId="674B3B54">
+          <wp:inline xmlns:wp14="http://schemas.microsoft.com/office/word/2010/wordprocessingDrawing" wp14:editId="6180ABCC" wp14:anchorId="674B3B54">
             <wp:extent cx="2828925" cy="1215314"/>
             <wp:effectExtent l="0" t="0" r="0" b="0"/>
             <wp:docPr id="1506783431" name="drawing"/>

</xml_diff>